<commit_message>
fix：_build_summary 限制高程取 MIN 聚合 fix：限高/超高取整精度对齐(_floor2/_ceil2) fix：空结果处理 (isEmpty/emptyMessage + 模板分支)
</commit_message>
<xml_diff>
--- a/app/report/templates/analysis_report_template.docx
+++ b/app/report/templates/analysis_report_template.docx
@@ -60,6 +60,21 @@
       </w:r>
       <w:proofErr w:type="spellEnd"/>
       <w:proofErr w:type="gramEnd"/>
+    </w:p>
+    <w:p>
+      <w:r>
+        <w:t>{% if isEmpty %}</w:t>
+      </w:r>
+    </w:p>
+    <w:p>
+      <w:r>
+        <w:t>{{ emptyMessage }}</w:t>
+      </w:r>
+    </w:p>
+    <w:p>
+      <w:r>
+        <w:t>{% else %}</w:t>
+      </w:r>
     </w:p>
     <w:bookmarkEnd w:id="0"/>
     <w:p>
@@ -2986,6 +3001,11 @@
       <w:cols w:space="720"/>
       <w:docGrid w:type="lines" w:linePitch="326"/>
     </w:sectPr>
+    <w:p>
+      <w:r>
+        <w:t>{% endif %}</w:t>
+      </w:r>
+    </w:p>
   </w:body>
 </w:document>
 </file>

</xml_diff>